<commit_message>
ENGG 27 | Proj3 Progrep3
</commit_message>
<xml_diff>
--- a/ENGG 151/Project 3/DOCS N SUBS/Estacio_ProgressReport2.docx
+++ b/ENGG 151/Project 3/DOCS N SUBS/Estacio_ProgressReport2.docx
@@ -345,17 +345,62 @@
         <w:rPr>
           <w:rFonts w:ascii="Liberation Serif" w:hAnsi="Liberation Serif"/>
         </w:rPr>
-        <w:t>. Lastly, progress includes printing to console all parsed input signal values, output signal values, and LTI system parameters. This is all in preparation for the LTI simulation itself, which is not implemented yet but will be done for Progress Report 3.</w:t>
-      </w:r>
-    </w:p>
-    <w:p>
-      <w:pPr>
-        <w:ind w:firstLine="720"/>
-        <w:jc w:val="both"/>
-        <w:rPr>
-          <w:rFonts w:ascii="Liberation Serif" w:hAnsi="Liberation Serif"/>
-        </w:rPr>
-      </w:pPr>
+        <w:t xml:space="preserve">. Lastly, progress includes printing to console all parsed input signal values, output signal values, and LTI system parameters. This is all in preparation for the LTI simulation itself, which </w:t>
+      </w:r>
+      <w:r>
+        <w:rPr>
+          <w:rFonts w:ascii="Liberation Serif" w:hAnsi="Liberation Serif"/>
+        </w:rPr>
+        <w:t>has</w:t>
+      </w:r>
+      <w:r>
+        <w:rPr>
+          <w:rFonts w:ascii="Liberation Serif" w:hAnsi="Liberation Serif"/>
+        </w:rPr>
+        <w:t xml:space="preserve"> not </w:t>
+      </w:r>
+      <w:r>
+        <w:rPr>
+          <w:rFonts w:ascii="Liberation Serif" w:hAnsi="Liberation Serif"/>
+        </w:rPr>
+        <w:t xml:space="preserve">been </w:t>
+      </w:r>
+      <w:r>
+        <w:rPr>
+          <w:rFonts w:ascii="Liberation Serif" w:hAnsi="Liberation Serif"/>
+        </w:rPr>
+        <w:t>implemented yet but will be done for Progress Report 3.</w:t>
+      </w:r>
+      <w:r>
+        <w:rPr>
+          <w:rFonts w:ascii="Liberation Serif" w:hAnsi="Liberation Serif"/>
+        </w:rPr>
+        <w:t xml:space="preserve"> Further progress then includes, the LTI simulation itself, allowing user commands and user input validation, and implementing a robust user interface. </w:t>
+      </w:r>
+      <w:r>
+        <w:rPr>
+          <w:rFonts w:ascii="Liberation Serif" w:hAnsi="Liberation Serif"/>
+        </w:rPr>
+        <w:t>A s</w:t>
+      </w:r>
+      <w:r>
+        <w:rPr>
+          <w:rFonts w:ascii="Liberation Serif" w:hAnsi="Liberation Serif"/>
+        </w:rPr>
+        <w:t>creenshot</w:t>
+      </w:r>
+      <w:r>
+        <w:rPr>
+          <w:rFonts w:ascii="Liberation Serif" w:hAnsi="Liberation Serif"/>
+        </w:rPr>
+        <w:t xml:space="preserve"> </w:t>
+      </w:r>
+      <w:r>
+        <w:rPr>
+          <w:rFonts w:ascii="Liberation Serif" w:hAnsi="Liberation Serif"/>
+        </w:rPr>
+        <w:t xml:space="preserve">of the current program output is shown below. </w:t>
+      </w:r>
     </w:p>
     <w:p>
       <w:pPr>
@@ -443,7 +488,6 @@
         <w:rPr>
           <w:noProof/>
         </w:rPr>
-        <w:lastRenderedPageBreak/>
         <w:drawing>
           <wp:inline distT="0" distB="0" distL="0" distR="0" wp14:anchorId="53ECE1AF" wp14:editId="5D1677A0">
             <wp:extent cx="6122035" cy="494665"/>
@@ -570,11 +614,19 @@
         </w:rPr>
         <w:t xml:space="preserve">compiler version – </w:t>
       </w:r>
-      <w:r>
-        <w:rPr>
-          <w:rFonts w:ascii="Liberation Serif" w:hAnsi="Liberation Serif"/>
-        </w:rPr>
-        <w:t>gcc version 15.2.0 (Rev8, Built by MSYS2 project)</w:t>
+      <w:proofErr w:type="spellStart"/>
+      <w:r>
+        <w:rPr>
+          <w:rFonts w:ascii="Liberation Serif" w:hAnsi="Liberation Serif"/>
+        </w:rPr>
+        <w:t>gcc</w:t>
+      </w:r>
+      <w:proofErr w:type="spellEnd"/>
+      <w:r>
+        <w:rPr>
+          <w:rFonts w:ascii="Liberation Serif" w:hAnsi="Liberation Serif"/>
+        </w:rPr>
+        <w:t xml:space="preserve"> version 15.2.0 (Rev8, Built by MSYS2 project)</w:t>
       </w:r>
     </w:p>
     <w:p>
@@ -756,7 +808,21 @@
         <w:rPr>
           <w:rFonts w:ascii="Liberation Serif" w:hAnsi="Liberation Serif"/>
         </w:rPr>
-        <w:t>IDE – Visual Studio Code ver 1.110.1</w:t>
+        <w:t xml:space="preserve">IDE – Visual Studio Code </w:t>
+      </w:r>
+      <w:proofErr w:type="spellStart"/>
+      <w:r>
+        <w:rPr>
+          <w:rFonts w:ascii="Liberation Serif" w:hAnsi="Liberation Serif"/>
+        </w:rPr>
+        <w:t>ver</w:t>
+      </w:r>
+      <w:proofErr w:type="spellEnd"/>
+      <w:r>
+        <w:rPr>
+          <w:rFonts w:ascii="Liberation Serif" w:hAnsi="Liberation Serif"/>
+        </w:rPr>
+        <w:t xml:space="preserve"> 1.110.1</w:t>
       </w:r>
     </w:p>
     <w:sectPr>

</xml_diff>

<commit_message>
ENGG 151 | Project 3 shenanigans
</commit_message>
<xml_diff>
--- a/ENGG 151/Project 3/DOCS N SUBS/Estacio_ProgressReport2.docx
+++ b/ENGG 151/Project 3/DOCS N SUBS/Estacio_ProgressReport2.docx
@@ -155,7 +155,15 @@
           <w:b/>
           <w:bCs/>
         </w:rPr>
-        <w:t>April 15</w:t>
+        <w:t xml:space="preserve">April </w:t>
+      </w:r>
+      <w:r>
+        <w:rPr>
+          <w:rFonts w:ascii="Liberation Serif" w:hAnsi="Liberation Serif"/>
+          <w:b/>
+          <w:bCs/>
+        </w:rPr>
+        <w:t>22</w:t>
       </w:r>
       <w:r>
         <w:rPr>
@@ -207,7 +215,7 @@
           <w:b/>
           <w:bCs/>
         </w:rPr>
-        <w:t>2</w:t>
+        <w:t>3</w:t>
       </w:r>
       <w:r>
         <w:rPr>
@@ -261,7 +269,13 @@
         <w:rPr>
           <w:rFonts w:ascii="Liberation Serif" w:hAnsi="Liberation Serif"/>
         </w:rPr>
-        <w:t>April 15</w:t>
+        <w:t xml:space="preserve">April </w:t>
+      </w:r>
+      <w:r>
+        <w:rPr>
+          <w:rFonts w:ascii="Liberation Serif" w:hAnsi="Liberation Serif"/>
+        </w:rPr>
+        <w:t>22</w:t>
       </w:r>
       <w:r>
         <w:rPr>
@@ -279,103 +293,19 @@
         <w:rPr>
           <w:rFonts w:ascii="Liberation Serif" w:hAnsi="Liberation Serif"/>
         </w:rPr>
+        <w:t xml:space="preserve">major </w:t>
+      </w:r>
+      <w:r>
+        <w:rPr>
+          <w:rFonts w:ascii="Liberation Serif" w:hAnsi="Liberation Serif"/>
+        </w:rPr>
         <w:t xml:space="preserve">progress has been made </w:t>
       </w:r>
       <w:r>
         <w:rPr>
           <w:rFonts w:ascii="Liberation Serif" w:hAnsi="Liberation Serif"/>
         </w:rPr>
-        <w:t xml:space="preserve">as the functions for parsing signal and system files have been implemented properly. First, the </w:t>
-      </w:r>
-      <w:r>
-        <w:rPr>
-          <w:rFonts w:ascii="Liberation Serif" w:hAnsi="Liberation Serif"/>
-        </w:rPr>
-        <w:t xml:space="preserve">function for parsing signal files was adjusted instead to a void function, instead modifying arrays initialized in the main function for both the input and output signal values. This is so that these arrays can then be passed for the LTI simulation functions in the future. From there, the function for parsing system files was programmed, storing all </w:t>
-      </w:r>
-      <w:r>
-        <w:rPr>
-          <w:rFonts w:ascii="Liberation Serif" w:hAnsi="Liberation Serif"/>
-          <w:i/>
-          <w:iCs/>
-        </w:rPr>
-        <w:t>a</w:t>
-      </w:r>
-      <w:r>
-        <w:rPr>
-          <w:rFonts w:ascii="Liberation Serif" w:hAnsi="Liberation Serif"/>
-          <w:i/>
-          <w:iCs/>
-        </w:rPr>
-        <w:t>-</w:t>
-      </w:r>
-      <w:r>
-        <w:rPr>
-          <w:rFonts w:ascii="Liberation Serif" w:hAnsi="Liberation Serif"/>
-        </w:rPr>
-        <w:t xml:space="preserve">coefficients and all </w:t>
-      </w:r>
-      <w:r>
-        <w:rPr>
-          <w:rFonts w:ascii="Liberation Serif" w:hAnsi="Liberation Serif"/>
-          <w:i/>
-          <w:iCs/>
-        </w:rPr>
-        <w:t>b</w:t>
-      </w:r>
-      <w:r>
-        <w:rPr>
-          <w:rFonts w:ascii="Liberation Serif" w:hAnsi="Liberation Serif"/>
-        </w:rPr>
-        <w:t xml:space="preserve">-coefficients in their respective </w:t>
-      </w:r>
-      <w:r>
-        <w:rPr>
-          <w:rFonts w:ascii="Liberation Serif" w:hAnsi="Liberation Serif"/>
-        </w:rPr>
-        <w:t xml:space="preserve">dynamically allocated </w:t>
-      </w:r>
-      <w:r>
-        <w:rPr>
-          <w:rFonts w:ascii="Liberation Serif" w:hAnsi="Liberation Serif"/>
-        </w:rPr>
-        <w:t>arrays</w:t>
-      </w:r>
-      <w:r>
-        <w:rPr>
-          <w:rFonts w:ascii="Liberation Serif" w:hAnsi="Liberation Serif"/>
-        </w:rPr>
-        <w:t xml:space="preserve">. Lastly, progress includes printing to console all parsed input signal values, output signal values, and LTI system parameters. This is all in preparation for the LTI simulation itself, which </w:t>
-      </w:r>
-      <w:r>
-        <w:rPr>
-          <w:rFonts w:ascii="Liberation Serif" w:hAnsi="Liberation Serif"/>
-        </w:rPr>
-        <w:t>has</w:t>
-      </w:r>
-      <w:r>
-        <w:rPr>
-          <w:rFonts w:ascii="Liberation Serif" w:hAnsi="Liberation Serif"/>
-        </w:rPr>
-        <w:t xml:space="preserve"> not </w:t>
-      </w:r>
-      <w:r>
-        <w:rPr>
-          <w:rFonts w:ascii="Liberation Serif" w:hAnsi="Liberation Serif"/>
-        </w:rPr>
-        <w:t xml:space="preserve">been </w:t>
-      </w:r>
-      <w:r>
-        <w:rPr>
-          <w:rFonts w:ascii="Liberation Serif" w:hAnsi="Liberation Serif"/>
-        </w:rPr>
-        <w:t>implemented yet but will be done for Progress Report 3.</w:t>
-      </w:r>
-      <w:r>
-        <w:rPr>
-          <w:rFonts w:ascii="Liberation Serif" w:hAnsi="Liberation Serif"/>
-        </w:rPr>
-        <w:t xml:space="preserve"> Further progress then includes, the LTI simulation itself, allowing user commands and user input validation, and implementing a robust user interface. </w:t>
+        <w:t xml:space="preserve">on the project. LTI simulation is functioning as intended, making use of dynamically allocated fixed-size arrays for processing and handling signal data. The simulation function can process both individual data manually entered via the console, as well as reading signal files as per the project’s specifications. The function is also able to iterate on previous calculations using pointer arithmetic and dynamic array allocation. Additionally, a basic user interface has been implemented, allowing all user commands specified in the project specs. Basic user input validation has also been implemented, keeping the main user interface robust. Lastly, an output log file is created upon calculating simulation results. As of now, reading signal files from files and manually entering signal data are simulated independently, as their results currently do not affect each other. Thus, further work includes integrating both methods properly into the program for simulation, tweaking the function to allow single signal input samples as a parameter, and reviewing all program functions to precisely follow specifications. </w:t>
       </w:r>
       <w:r>
         <w:rPr>
@@ -414,10 +344,10 @@
           <w:noProof/>
         </w:rPr>
         <w:drawing>
-          <wp:inline distT="0" distB="0" distL="0" distR="0" wp14:anchorId="4179C44E" wp14:editId="776CCE5B">
-            <wp:extent cx="5362575" cy="3638550"/>
-            <wp:effectExtent l="0" t="0" r="9525" b="0"/>
-            <wp:docPr id="811223535" name="Picture 1"/>
+          <wp:inline distT="0" distB="0" distL="0" distR="0" wp14:anchorId="398D4BD7" wp14:editId="551ADB19">
+            <wp:extent cx="5067300" cy="3674463"/>
+            <wp:effectExtent l="0" t="0" r="0" b="2540"/>
+            <wp:docPr id="1281325310" name="Picture 1"/>
             <wp:cNvGraphicFramePr>
               <a:graphicFrameLocks xmlns:a="http://schemas.openxmlformats.org/drawingml/2006/main" noChangeAspect="1"/>
             </wp:cNvGraphicFramePr>
@@ -425,7 +355,7 @@
               <a:graphicData uri="http://schemas.openxmlformats.org/drawingml/2006/picture">
                 <pic:pic xmlns:pic="http://schemas.openxmlformats.org/drawingml/2006/picture">
                   <pic:nvPicPr>
-                    <pic:cNvPr id="811223535" name=""/>
+                    <pic:cNvPr id="1281325310" name=""/>
                     <pic:cNvPicPr/>
                   </pic:nvPicPr>
                   <pic:blipFill>
@@ -437,7 +367,7 @@
                   <pic:spPr>
                     <a:xfrm>
                       <a:off x="0" y="0"/>
-                      <a:ext cx="5362575" cy="3638550"/>
+                      <a:ext cx="5071741" cy="3677683"/>
                     </a:xfrm>
                     <a:prstGeom prst="rect">
                       <a:avLst/>
@@ -467,6 +397,7 @@
         <w:rPr>
           <w:rFonts w:ascii="Liberation Serif" w:hAnsi="Liberation Serif"/>
         </w:rPr>
+        <w:lastRenderedPageBreak/>
         <w:t>sample screenshot – executable main.exe run and resulting output to console</w:t>
       </w:r>
     </w:p>
@@ -489,10 +420,10 @@
           <w:noProof/>
         </w:rPr>
         <w:drawing>
-          <wp:inline distT="0" distB="0" distL="0" distR="0" wp14:anchorId="53ECE1AF" wp14:editId="5D1677A0">
-            <wp:extent cx="6122035" cy="494665"/>
-            <wp:effectExtent l="0" t="0" r="0" b="635"/>
-            <wp:docPr id="888631158" name="Picture 1"/>
+          <wp:inline distT="0" distB="0" distL="0" distR="0" wp14:anchorId="523EDB2B" wp14:editId="0DD2AF70">
+            <wp:extent cx="6122035" cy="497840"/>
+            <wp:effectExtent l="0" t="0" r="0" b="0"/>
+            <wp:docPr id="387256739" name="Picture 1"/>
             <wp:cNvGraphicFramePr>
               <a:graphicFrameLocks xmlns:a="http://schemas.openxmlformats.org/drawingml/2006/main" noChangeAspect="1"/>
             </wp:cNvGraphicFramePr>
@@ -500,7 +431,7 @@
               <a:graphicData uri="http://schemas.openxmlformats.org/drawingml/2006/picture">
                 <pic:pic xmlns:pic="http://schemas.openxmlformats.org/drawingml/2006/picture">
                   <pic:nvPicPr>
-                    <pic:cNvPr id="888631158" name=""/>
+                    <pic:cNvPr id="387256739" name=""/>
                     <pic:cNvPicPr/>
                   </pic:nvPicPr>
                   <pic:blipFill>
@@ -512,7 +443,7 @@
                   <pic:spPr>
                     <a:xfrm>
                       <a:off x="0" y="0"/>
-                      <a:ext cx="6122035" cy="494665"/>
+                      <a:ext cx="6122035" cy="497840"/>
                     </a:xfrm>
                     <a:prstGeom prst="rect">
                       <a:avLst/>
@@ -734,14 +665,6 @@
         </w:rPr>
         <w:t>7840</w:t>
       </w:r>
-    </w:p>
-    <w:p>
-      <w:pPr>
-        <w:jc w:val="center"/>
-        <w:rPr>
-          <w:noProof/>
-        </w:rPr>
-      </w:pPr>
     </w:p>
     <w:p>
       <w:pPr>

</xml_diff>